<commit_message>
notificaciones, crear, actualizar contadores
</commit_message>
<xml_diff>
--- a/src/agents/PMsito/data/formatoReportePlannerCRM.docx
+++ b/src/agents/PMsito/data/formatoReportePlannerCRM.docx
@@ -4,15 +4,7 @@
   <w:body>
     <w:p>
       <w:r>
-        <w:t>{</w:t>
-      </w:r>
-      <w:proofErr w:type="gramStart"/>
-      <w:r>
-        <w:t xml:space="preserve">proyecto}   </w:t>
-      </w:r>
-      <w:proofErr w:type="gramEnd"/>
-      <w:r>
-        <w:t xml:space="preserve">                Reporte generado el: {fecha}</w:t>
+        <w:t>{proyecto}                   Reporte generado el: {fecha}</w:t>
       </w:r>
     </w:p>
     <w:p/>
@@ -64,15 +56,10 @@
     </w:p>
     <w:p>
       <w:r>
-        <w:t>{</w:t>
+        <w:t>{index}. {Tarea} — {Estado} — {porcentaje_100}</w:t>
       </w:r>
-      <w:proofErr w:type="spellStart"/>
       <w:r>
-        <w:t>index</w:t>
-      </w:r>
-      <w:proofErr w:type="spellEnd"/>
-      <w:r>
-        <w:t>}. {Tarea} — {Estado} — {porcentaje}/{porcentaje_100}</w:t>
+        <w:t>%</w:t>
       </w:r>
     </w:p>
     <w:p>
@@ -83,15 +70,7 @@
     <w:p/>
     <w:p>
       <w:r>
-        <w:t>{/</w:t>
-      </w:r>
-      <w:proofErr w:type="spellStart"/>
-      <w:r>
-        <w:t>groups</w:t>
-      </w:r>
-      <w:proofErr w:type="spellEnd"/>
-      <w:r>
-        <w:t>}</w:t>
+        <w:t>{/groups}</w:t>
       </w:r>
     </w:p>
     <w:sectPr>
@@ -3760,6 +3739,7 @@
   <w:style w:type="character" w:default="1" w:styleId="Fuentedeprrafopredeter">
     <w:name w:val="Default Paragraph Font"/>
     <w:uiPriority w:val="1"/>
+    <w:semiHidden/>
     <w:unhideWhenUsed/>
   </w:style>
   <w:style w:type="table" w:default="1" w:styleId="Tablanormal">
@@ -4216,23 +4196,6 @@
 </file>
 
 <file path=customXml/item1.xml><?xml version="1.0" encoding="utf-8"?>
-<?mso-contentType ?>
-<FormTemplates xmlns="http://schemas.microsoft.com/sharepoint/v3/contenttype/forms">
-  <Display>DocumentLibraryForm</Display>
-  <Edit>DocumentLibraryForm</Edit>
-  <New>DocumentLibraryForm</New>
-</FormTemplates>
-</file>
-
-<file path=customXml/item2.xml><?xml version="1.0" encoding="utf-8"?>
-<p:properties xmlns:p="http://schemas.microsoft.com/office/2006/metadata/properties" xmlns:xsi="http://www.w3.org/2001/XMLSchema-instance" xmlns:pc="http://schemas.microsoft.com/office/infopath/2007/PartnerControls">
-  <documentManagement>
-    <_activity xmlns="0625d264-c40d-48e6-b5d0-1745c31c5ae4" xsi:nil="true"/>
-  </documentManagement>
-</p:properties>
-</file>
-
-<file path=customXml/item3.xml><?xml version="1.0" encoding="utf-8"?>
 <ct:contentTypeSchema xmlns:ct="http://schemas.microsoft.com/office/2006/metadata/contentType" xmlns:ma="http://schemas.microsoft.com/office/2006/metadata/properties/metaAttributes" ct:_="" ma:_="" ma:contentTypeName="Documento" ma:contentTypeID="0x0101006CF0BC4EF6264D4BAE5F175E20A33758" ma:contentTypeVersion="15" ma:contentTypeDescription="Crear nuevo documento." ma:contentTypeScope="" ma:versionID="b7aece46f29265028c1a2726d3f9d148">
   <xsd:schema xmlns:xsd="http://www.w3.org/2001/XMLSchema" xmlns:xs="http://www.w3.org/2001/XMLSchema" xmlns:p="http://schemas.microsoft.com/office/2006/metadata/properties" xmlns:ns3="0625d264-c40d-48e6-b5d0-1745c31c5ae4" xmlns:ns4="14995062-9091-4990-8451-91e8aaebe1f2" targetNamespace="http://schemas.microsoft.com/office/2006/metadata/properties" ma:root="true" ma:fieldsID="5c7d1fbbf02ee96d65e7df6825dab7f9" ns3:_="" ns4:_="">
     <xsd:import namespace="0625d264-c40d-48e6-b5d0-1745c31c5ae4"/>
@@ -4465,25 +4428,24 @@
 </ct:contentTypeSchema>
 </file>
 
-<file path=customXml/itemProps1.xml><?xml version="1.0" encoding="utf-8"?>
-<ds:datastoreItem xmlns:ds="http://schemas.openxmlformats.org/officeDocument/2006/customXml" ds:itemID="{9C9D36FA-F606-4FE2-AFA1-3F53C77FD864}">
-  <ds:schemaRefs>
-    <ds:schemaRef ds:uri="http://schemas.microsoft.com/sharepoint/v3/contenttype/forms"/>
-  </ds:schemaRefs>
-</ds:datastoreItem>
+<file path=customXml/item2.xml><?xml version="1.0" encoding="utf-8"?>
+<p:properties xmlns:p="http://schemas.microsoft.com/office/2006/metadata/properties" xmlns:xsi="http://www.w3.org/2001/XMLSchema-instance" xmlns:pc="http://schemas.microsoft.com/office/infopath/2007/PartnerControls">
+  <documentManagement>
+    <_activity xmlns="0625d264-c40d-48e6-b5d0-1745c31c5ae4" xsi:nil="true"/>
+  </documentManagement>
+</p:properties>
 </file>
 
-<file path=customXml/itemProps2.xml><?xml version="1.0" encoding="utf-8"?>
-<ds:datastoreItem xmlns:ds="http://schemas.openxmlformats.org/officeDocument/2006/customXml" ds:itemID="{B82F582E-6B5F-4B68-BFC6-8BA807D1B891}">
-  <ds:schemaRefs>
-    <ds:schemaRef ds:uri="http://schemas.microsoft.com/office/2006/metadata/properties"/>
-    <ds:schemaRef ds:uri="http://schemas.microsoft.com/office/infopath/2007/PartnerControls"/>
-    <ds:schemaRef ds:uri="0625d264-c40d-48e6-b5d0-1745c31c5ae4"/>
-  </ds:schemaRefs>
-</ds:datastoreItem>
+<file path=customXml/item3.xml><?xml version="1.0" encoding="utf-8"?>
+<?mso-contentType ?>
+<FormTemplates xmlns="http://schemas.microsoft.com/sharepoint/v3/contenttype/forms">
+  <Display>DocumentLibraryForm</Display>
+  <Edit>DocumentLibraryForm</Edit>
+  <New>DocumentLibraryForm</New>
+</FormTemplates>
 </file>
 
-<file path=customXml/itemProps3.xml><?xml version="1.0" encoding="utf-8"?>
+<file path=customXml/itemProps1.xml><?xml version="1.0" encoding="utf-8"?>
 <ds:datastoreItem xmlns:ds="http://schemas.openxmlformats.org/officeDocument/2006/customXml" ds:itemID="{2DEAED97-CBC8-4E94-AF2A-95D60CDCEDBA}">
   <ds:schemaRefs>
     <ds:schemaRef ds:uri="http://schemas.microsoft.com/office/2006/metadata/contentType"/>
@@ -4500,4 +4462,22 @@
     <ds:schemaRef ds:uri="http://schemas.microsoft.com/internal/obd"/>
   </ds:schemaRefs>
 </ds:datastoreItem>
+</file>
+
+<file path=customXml/itemProps2.xml><?xml version="1.0" encoding="utf-8"?>
+<ds:datastoreItem xmlns:ds="http://schemas.openxmlformats.org/officeDocument/2006/customXml" ds:itemID="{B82F582E-6B5F-4B68-BFC6-8BA807D1B891}">
+  <ds:schemaRefs>
+    <ds:schemaRef ds:uri="http://schemas.microsoft.com/office/2006/metadata/properties"/>
+    <ds:schemaRef ds:uri="http://schemas.microsoft.com/office/infopath/2007/PartnerControls"/>
+    <ds:schemaRef ds:uri="0625d264-c40d-48e6-b5d0-1745c31c5ae4"/>
+  </ds:schemaRefs>
+</ds:datastoreItem>
+</file>
+
+<file path=customXml/itemProps3.xml><?xml version="1.0" encoding="utf-8"?>
+<ds:datastoreItem xmlns:ds="http://schemas.openxmlformats.org/officeDocument/2006/customXml" ds:itemID="{9C9D36FA-F606-4FE2-AFA1-3F53C77FD864}">
+  <ds:schemaRefs>
+    <ds:schemaRef ds:uri="http://schemas.microsoft.com/sharepoint/v3/contenttype/forms"/>
+  </ds:schemaRefs>
+</ds:datastoreItem>
 </file>
</xml_diff>